<commit_message>
06 sample: blog-tone wording pass, structure frozen; ci deps pinned
</commit_message>
<xml_diff>
--- a/reports/分报告/06_算法报告_LLM-Agent工具调用整定.docx
+++ b/reports/分报告/06_算法报告_LLM-Agent工具调用整定.docx
@@ -18,6 +18,92 @@
       </w:r>
     </w:p>
     <w:p/>
+    <w:p>
+      <w:pPr>
+        <w:spacing w:after="40"/>
+        <w:ind w:left="340"/>
+      </w:pPr>
+      <w:r>
+        <w:rPr>
+          <w:rFonts w:ascii="微软雅黑" w:hAnsi="微软雅黑" w:eastAsia="微软雅黑"/>
+          <w:b/>
+          <w:i w:val="0"/>
+          <w:color w:val="595959"/>
+          <w:sz w:val="19"/>
+        </w:rPr>
+        <w:t>30 秒看懂</w:t>
+      </w:r>
+      <w:r>
+        <w:rPr>
+          <w:rFonts w:ascii="微软雅黑" w:hAnsi="微软雅黑" w:eastAsia="微软雅黑"/>
+          <w:b w:val="0"/>
+          <w:i w:val="0"/>
+          <w:color w:val="595959"/>
+          <w:sz w:val="19"/>
+        </w:rPr>
+        <w:t>：你有一个调好的 IMC 参数，大模型帮你试着微调——它只能"看历史、提候选"，</w:t>
+      </w:r>
+      <w:r>
+        <w:rPr>
+          <w:rFonts w:ascii="微软雅黑" w:hAnsi="微软雅黑" w:eastAsia="微软雅黑"/>
+          <w:b/>
+          <w:i w:val="0"/>
+          <w:color w:val="595959"/>
+          <w:sz w:val="19"/>
+        </w:rPr>
+        <w:t>换不换它说了不算</w:t>
+      </w:r>
+      <w:r>
+        <w:rPr>
+          <w:rFonts w:ascii="微软雅黑" w:hAnsi="微软雅黑" w:eastAsia="微软雅黑"/>
+          <w:b w:val="0"/>
+          <w:i w:val="0"/>
+          <w:color w:val="595959"/>
+          <w:sz w:val="19"/>
+        </w:rPr>
+        <w:t xml:space="preserve">，仿真器算一遍账，好才换、不好就留原样。想自己跑：一条命令 </w:t>
+      </w:r>
+      <w:r>
+        <w:rPr>
+          <w:rFonts w:ascii="Consolas" w:hAnsi="Consolas" w:eastAsia="微软雅黑"/>
+          <w:b w:val="0"/>
+          <w:i w:val="0"/>
+          <w:color w:val="A31515"/>
+          <w:sz w:val="17"/>
+        </w:rPr>
+        <w:t>run_llm_agent_demo.py --provider openai-compatible --model qwen-plus --setpoint 24 --seed 71</w:t>
+      </w:r>
+      <w:r>
+        <w:rPr>
+          <w:rFonts w:ascii="微软雅黑" w:hAnsi="微软雅黑" w:eastAsia="微软雅黑"/>
+          <w:b w:val="0"/>
+          <w:i w:val="0"/>
+          <w:color w:val="595959"/>
+          <w:sz w:val="19"/>
+        </w:rPr>
+        <w:t xml:space="preserve">，几十秒出结果（要花一点 API 钱，key 放 </w:t>
+      </w:r>
+      <w:r>
+        <w:rPr>
+          <w:rFonts w:ascii="Consolas" w:hAnsi="Consolas" w:eastAsia="微软雅黑"/>
+          <w:b w:val="0"/>
+          <w:i w:val="0"/>
+          <w:color w:val="A31515"/>
+          <w:sz w:val="17"/>
+        </w:rPr>
+        <w:t>.env</w:t>
+      </w:r>
+      <w:r>
+        <w:rPr>
+          <w:rFonts w:ascii="微软雅黑" w:hAnsi="微软雅黑" w:eastAsia="微软雅黑"/>
+          <w:b w:val="0"/>
+          <w:i w:val="0"/>
+          <w:color w:val="595959"/>
+          <w:sz w:val="19"/>
+        </w:rPr>
+        <w:t>）。</w:t>
+      </w:r>
+    </w:p>
     <w:p>
       <w:pPr>
         <w:spacing w:after="80"/>
@@ -130,7 +216,7 @@
           <w:i w:val="0"/>
           <w:sz w:val="21"/>
         </w:rPr>
-        <w:t>仿真器与确定性安全门拥有最终决定权</w:t>
+        <w:t>最后拍板的是仿真器和一道死的检查规则，不是模型</w:t>
       </w:r>
       <w:r>
         <w:rPr>
@@ -306,7 +392,7 @@
                 <w:i w:val="0"/>
                 <w:sz w:val="18"/>
               </w:rPr>
-              <w:t xml:space="preserve">Kp/Ki 修正建议（原始建议 → 安全门限幅 → 接受/拒绝）；v4 走读部署 </w:t>
+              <w:t xml:space="preserve">Kp/Ki 修改建议（模型原话 → 限幅 → 留下/扔掉）；v4 走读留下 </w:t>
             </w:r>
             <w:r>
               <w:rPr>
@@ -324,7 +410,7 @@
                 <w:i w:val="0"/>
                 <w:sz w:val="18"/>
               </w:rPr>
-              <w:t>（基线 0.5175/0.0040536 的 −10.0%；v3 走读为 0.4057/0.002769，基线不同，见第 4 节）</w:t>
+              <w:t>（老参数 0.5175/0.0040536 的九折；v3 走读留下的是 0.4057/0.002769，起点不一样，见第 4 节）</w:t>
             </w:r>
           </w:p>
         </w:tc>
@@ -695,7 +781,7 @@
                 <w:i w:val="0"/>
                 <w:sz w:val="18"/>
               </w:rPr>
-              <w:t>Agent 自主选择工具与候选，无需人工逐步干预；但它是"诊断+建议"性质，不追求单点指标最优</w:t>
+              <w:t>Agent 自己决定看什么、试什么，不用人一步步点；但它只负责"诊断+给建议"，不保证找到全局最优</w:t>
             </w:r>
           </w:p>
         </w:tc>
@@ -810,7 +896,7 @@
           <w:i w:val="0"/>
           <w:sz w:val="21"/>
         </w:rPr>
-        <w:t>被安全门拒绝</w:t>
+        <w:t>没通过，弃了</w:t>
       </w:r>
       <w:r>
         <w:rPr>
@@ -819,7 +905,7 @@
           <w:i w:val="0"/>
           <w:sz w:val="21"/>
         </w:rPr>
-        <w:t xml:space="preserve"> → 候选②（小幅减小 Kp/Ki 至 0.4657/0.003648，风险 59.49→58.86，改善 1.05%）</w:t>
+        <w:t xml:space="preserve"> → 候选②（小幅减小 Kp/Ki 至 0.4657/0.003648，风险 59.49→58.86，变好 1.05%）</w:t>
       </w:r>
       <w:r>
         <w:rPr>
@@ -828,7 +914,7 @@
           <w:i w:val="0"/>
           <w:sz w:val="21"/>
         </w:rPr>
-        <w:t>被接受并部署</w:t>
+        <w:t>留下并用上了</w:t>
       </w:r>
       <w:r>
         <w:rPr>
@@ -837,7 +923,7 @@
           <w:i w:val="0"/>
           <w:sz w:val="21"/>
         </w:rPr>
-        <w:t xml:space="preserve"> → Agent 主动 finish（自述"预算仅剩 1 次、已有边际改善，不值得再冒险，部署当前已接受增益"）。v3 走读（基线 0.4508/0.003077，风险 32.01→30.68，改善 4.15%，部署 0.4057/0.002769）保留在第 4 节作对照——</w:t>
+        <w:t xml:space="preserve"> → Agent 主动收工（自述"预算仅剩 1 次、已有边际改善，不值得再冒险，部署当前已接受增益"）。v3 走读（基线 0.4508/0.003077，风险 32.01→30.68，好 4.15%，留下 0.4057/0.002769）保留在第 4 节作对照——</w:t>
       </w:r>
       <w:r>
         <w:rPr>
@@ -846,7 +932,7 @@
           <w:i w:val="0"/>
           <w:sz w:val="21"/>
         </w:rPr>
-        <w:t>两次基线不同（0.5175 vs 0.4508），J 绝对值不可跨批次比较，只能各自看相对改善与部署判定</w:t>
+        <w:t>两次起点不同（0.5175 和 0.4508），总分不可跨批次直接比，只能各自看变好多少和留没留下</w:t>
       </w:r>
       <w:r>
         <w:rPr>
@@ -855,7 +941,7 @@
           <w:i w:val="0"/>
           <w:sz w:val="21"/>
         </w:rPr>
-        <w:t>。v4 矩阵其余 17 次会话候选全部被拒、回退 IMC；18 次会话均无越界、零失控，回退机制按设计生效。</w:t>
+        <w:t>。v4 矩阵剩下 17 次提的还原样用老参数；18 次都没越界、没失控，兜底正常干活。</w:t>
       </w:r>
     </w:p>
     <w:p>
@@ -921,7 +1007,7 @@
           <w:i w:val="0"/>
           <w:sz w:val="21"/>
         </w:rPr>
-        <w:t>（读取历史整定记录）、</w:t>
+        <w:t>（翻历史记录）、</w:t>
       </w:r>
       <w:r>
         <w:rPr>
@@ -940,7 +1026,7 @@
           <w:i w:val="0"/>
           <w:sz w:val="21"/>
         </w:rPr>
-        <w:t>（提出候选并请求宿主评估）、</w:t>
+        <w:t>（报一组候选数、让宿主拿仿真器验货）、</w:t>
       </w:r>
       <w:r>
         <w:rPr>
@@ -959,7 +1045,7 @@
           <w:i w:val="0"/>
           <w:sz w:val="21"/>
         </w:rPr>
-        <w:t>（主动终止）。关键在于</w:t>
+        <w:t>（主动收工）。关键在于</w:t>
       </w:r>
       <w:r>
         <w:rPr>
@@ -968,7 +1054,7 @@
           <w:i w:val="0"/>
           <w:sz w:val="21"/>
         </w:rPr>
-        <w:t>候选是否生效由宿主的确定性安全门判定，不由模型决定</w:t>
+        <w:t>候选能不能用，由宿主按死规则说了算，不由模型说了算</w:t>
       </w:r>
       <w:r>
         <w:rPr>
@@ -977,7 +1063,7 @@
           <w:i w:val="0"/>
           <w:sz w:val="21"/>
         </w:rPr>
-        <w:t>：只有"风险调整改进量 &gt; 0"的候选才被接受，被拒的候选不改变状态、预算照扣。图 6-2 把一次真实调用会话的每一步画了出来。</w:t>
+        <w:t>：只有"算完账确实比原来好"的候选才被留下，不好的直接扔掉、但试验次数照扣。图 6-2 把一次真实调用会话的每一步画了出来。</w:t>
       </w:r>
     </w:p>
     <w:p>
@@ -1772,7 +1858,7 @@
                 <w:i w:val="0"/>
                 <w:sz w:val="18"/>
               </w:rPr>
-              <w:t>宿主执行最终部署资格化</w:t>
+              <w:t>宿主最后再验一次、确认能用</w:t>
             </w:r>
           </w:p>
         </w:tc>
@@ -1824,7 +1910,7 @@
           <w:i w:val="0"/>
           <w:sz w:val="21"/>
         </w:rPr>
-        <w:t>决定权在宿主，不在模型</w:t>
+        <w:t>拍板的是宿主，不是模型</w:t>
       </w:r>
       <w:r>
         <w:rPr>
@@ -1833,7 +1919,7 @@
           <w:i w:val="0"/>
           <w:sz w:val="21"/>
         </w:rPr>
-        <w:t>。2 次候选试验中，模型"想改"的都被如实评估了，但只有 1 次被采纳。第 4 步模型想增大增益，安全门以"风险调整改进为负（−2.30%）"挡回——</w:t>
+        <w:t>。2 次候选试验里，模型"想改"的都拿去仿真器真算了一遍，但只留了 1 个。第 4 步模型想加增益，宿主算完账发现更差了（−2.30%）就挡了回去——</w:t>
       </w:r>
       <w:r>
         <w:rPr>
@@ -1851,7 +1937,7 @@
           <w:i w:val="0"/>
           <w:sz w:val="21"/>
         </w:rPr>
-        <w:t>，这就是拒绝机制的可视化。第 5 步模型改换方向（从"增大"改为"减小"）并命中；注意它先连查了 3 次历史才动手，比 v3 走读更保守。</w:t>
+        <w:t>，这就是"不行就不用"的样子。第 5 步模型换了个方向（从"加大"改成"减小"）才通过；注意它先连看了 3 次历史才动手，比 v3 走读更稳。</w:t>
       </w:r>
     </w:p>
     <w:p>
@@ -1876,7 +1962,7 @@
           <w:i w:val="0"/>
           <w:sz w:val="21"/>
         </w:rPr>
-        <w:t>模型的推理链是自述且可审计的</w:t>
+        <w:t>模型的想法全程留痕，能审计</w:t>
       </w:r>
       <w:r>
         <w:rPr>
@@ -1904,7 +1990,7 @@
           <w:i w:val="0"/>
           <w:sz w:val="21"/>
         </w:rPr>
-        <w:t xml:space="preserve"> 字段记录了完整理由（"在允许的最大 10% 变化幅度内""仅剩 2 次试验"），这是 BO / RL 这类数值寻优路线不具备的可解释性，也是第 8 节"推理过程天然可读、可审计"的依据。</w:t>
+        <w:t xml:space="preserve"> 字段都写了理由（"只在允许的 10% 幅度内动""还剩 2 次机会"），这是 BO / RL 这类纯数值搜索没有的——它为什么这么试，你看得见，这也是第 8 节说的"过程可读"的依据。</w:t>
       </w:r>
     </w:p>
     <w:p>
@@ -1929,7 +2015,7 @@
           <w:i w:val="0"/>
           <w:sz w:val="21"/>
         </w:rPr>
-        <w:t>改良幅度不大，定位是微调而非重整定</w:t>
+        <w:t>改良幅度不大，它就是个微调工</w:t>
       </w:r>
       <w:r>
         <w:rPr>
@@ -1938,7 +2024,7 @@
           <w:i w:val="0"/>
           <w:sz w:val="21"/>
         </w:rPr>
-        <w:t>。风险目标从 59.49 降到 58.86，改善 1.05%；部署增益 Kp=0.4657、Ki=0.003648 相对基线走的是</w:t>
+        <w:t>。风险目标从 59.49 降到 58.86，只好了 1.05%；新参数 Kp=0.4657、Ki=0.003648 都是往</w:t>
       </w:r>
       <w:r>
         <w:rPr>
@@ -1956,7 +2042,7 @@
           <w:i w:val="0"/>
           <w:sz w:val="21"/>
         </w:rPr>
-        <w:t>方向，且双双恰为基线 ×0.90（</w:t>
+        <w:t>方向走，而且正好是老参数打九折（</w:t>
       </w:r>
       <w:r>
         <w:rPr>
@@ -1965,7 +2051,7 @@
           <w:i w:val="0"/>
           <w:sz w:val="21"/>
         </w:rPr>
-        <w:t>−10.0%，正好打在单次信任域下界</w:t>
+        <w:t>−10.0%，一步只允许走 10%，这次走满了</w:t>
       </w:r>
       <w:r>
         <w:rPr>
@@ -1974,7 +2060,7 @@
           <w:i w:val="0"/>
           <w:sz w:val="21"/>
         </w:rPr>
-        <w:t>）。不要期待这条路产出一个全局最优增益——它的产出是"一次安全的、有理由的小幅改良"。另注意 v4 基线（0.5175/0.0040536）与 v3 走读基线（0.4508/0.003077）不同，改善百分比各自相对自身基线，J 绝对值（59 vs 32）不可跨批次比较。</w:t>
+        <w:t>）。别指望它给你变出一个全局最优——它的产出就是"一次安全的、有理由的小调整"。另注意 v4 起点（0.5175/0.0040536）和 v3 走读起点（0.4508/0.003077）不一样，好几个百分点都是相对各自起点算的，总分（59 和 32）不能跨批次直接比。</w:t>
       </w:r>
     </w:p>
     <w:p>
@@ -1999,7 +2085,7 @@
           <w:i w:val="0"/>
           <w:sz w:val="21"/>
         </w:rPr>
-        <w:t>诚实边界：模型输出是非确定的，v4 给出了 18 次采样的分布</w:t>
+        <w:t>实话实说：模型每次给的答案可能不一样，v4 拿 18 次证明了这点</w:t>
       </w:r>
       <w:r>
         <w:rPr>
@@ -2008,7 +2094,7 @@
           <w:i w:val="0"/>
           <w:sz w:val="21"/>
         </w:rPr>
-        <w:t>。v4 矩阵 18 次真实调用中仅 1 次部署（</w:t>
+        <w:t>。v4 矩阵 18 次真实调用里只有 1 次留下了候选（</w:t>
       </w:r>
       <w:r>
         <w:rPr>
@@ -2027,7 +2113,7 @@
           <w:i w:val="0"/>
           <w:sz w:val="21"/>
         </w:rPr>
-        <w:t xml:space="preserve">，即本节走读），其余 17 次候选全部被拒、回退 IMC；其中 </w:t>
+        <w:t xml:space="preserve">，就是本节走读这篇），剩下 17 次提的都被退回、用回老参数；其中 </w:t>
       </w:r>
       <w:r>
         <w:rPr>
@@ -2046,7 +2132,7 @@
           <w:i w:val="0"/>
           <w:sz w:val="21"/>
         </w:rPr>
-        <w:t xml:space="preserve"> 三个会话（三个模型各一）回退的 IMC 基线在演示 rollout 上本身不稳定（</w:t>
+        <w:t xml:space="preserve"> 三个会话（三个模型各一）退回去的老参数在演示场景里本身就跑不稳（</w:t>
       </w:r>
       <w:r>
         <w:rPr>
@@ -2065,7 +2151,7 @@
           <w:i w:val="0"/>
           <w:sz w:val="21"/>
         </w:rPr>
-        <w:t xml:space="preserve">）——注意这是 </w:t>
+        <w:t>）——注意这是</w:t>
       </w:r>
       <w:r>
         <w:rPr>
@@ -2074,7 +2160,7 @@
           <w:i w:val="0"/>
           <w:sz w:val="21"/>
         </w:rPr>
-        <w:t>fallback 增益在该种子场景下不稳定</w:t>
+        <w:t>老参数在那个种子下就不行</w:t>
       </w:r>
       <w:r>
         <w:rPr>
@@ -2083,7 +2169,7 @@
           <w:i w:val="0"/>
           <w:sz w:val="21"/>
         </w:rPr>
-        <w:t xml:space="preserve">，不是模型发散，安全门与 commissioning 门均按设计兜住（18 次会话零越界、零失控）。v3 情况对照：18 次真实调用、5/18 部署、18/18 稳定，走读为 </w:t>
+        <w:t xml:space="preserve">，不是模型搞坏了，兜底和上线检查都正常接住了（18 次零越界、零失控）。v3 那边对照：18 次里留了 5 个、18 次全稳，走读是 </w:t>
       </w:r>
       <w:r>
         <w:rPr>
@@ -2102,7 +2188,7 @@
           <w:i w:val="0"/>
           <w:sz w:val="21"/>
         </w:rPr>
-        <w:t>（基线 32.01→30.68，+4.15%，部署 0.4057/0.002769）。两次独立采样部署率不同（5/18 vs 1/18），恰好说明</w:t>
+        <w:t>（32.01→30.68，好 4.15%，留下 0.4057/0.002769）。两次留存率不同（5/18 和 1/18），正好说明</w:t>
       </w:r>
       <w:r>
         <w:rPr>
@@ -2111,7 +2197,7 @@
           <w:i w:val="0"/>
           <w:sz w:val="21"/>
         </w:rPr>
-        <w:t>单次走读不能代表路线期望性能</w:t>
+        <w:t>看一次走读等于只看了一次抽奖，必须看分布</w:t>
       </w:r>
       <w:r>
         <w:rPr>
@@ -2120,7 +2206,7 @@
           <w:i w:val="0"/>
           <w:sz w:val="21"/>
         </w:rPr>
-        <w:t>，必须看分布（见第 8 节小结与附录 A）。</w:t>
+        <w:t>（见第 8 节小结与附录 A）。</w:t>
       </w:r>
     </w:p>
     <w:p>
@@ -2435,7 +2521,7 @@
           <w:i w:val="0"/>
           <w:sz w:val="21"/>
         </w:rPr>
-        <w:t>补跑说明：用 v4 走读部署增益（0.4657/0.003648）在 v3 同对象、同约束、同种子下补仿，标题标注"补跑"（v3 增益 0.4057/0.002769 的旧表已归档，见附录 A）。</w:t>
+        <w:t>补跑说明：拿 v4 走读留下的参数（0.4657/0.003648）在 v3 同对象、同约束、同种子下重跑一遍，标题写"补跑"（v3 参数 0.4057/0.002769 的旧表已归档，见附录 A）。</w:t>
       </w:r>
     </w:p>
     <w:tbl>
@@ -3121,7 +3207,7 @@
           <w:i w:val="0"/>
           <w:sz w:val="21"/>
         </w:rPr>
-        <w:t>：v4 部署增益（0.4657）比 v3 走读增益（0.4057）更接近基线、更激进，因此三工况表现</w:t>
+        <w:t>：v4 留下的这组参数（0.4657）比 v3 那组（0.4057）更接近老参数、下手更重，所以三工况成绩</w:t>
       </w:r>
       <w:r>
         <w:rPr>
@@ -3130,7 +3216,7 @@
           <w:i w:val="0"/>
           <w:sz w:val="21"/>
         </w:rPr>
-        <w:t>劣于</w:t>
+        <w:t>不如</w:t>
       </w:r>
       <w:r>
         <w:rPr>
@@ -3139,7 +3225,7 @@
           <w:i w:val="0"/>
           <w:sz w:val="21"/>
         </w:rPr>
-        <w:t xml:space="preserve"> v3 候选：工况一 ITAE 4.15 略优但过冷 0.64 °C（v3 为 0.29 °C）；工况二/三调节时间分别顶到 5.00 h / 6.00 h 时窗边缘（时窗内未收敛）、过冷破 1 °C。必须如实指出：</w:t>
+        <w:t xml:space="preserve"> v3 那组：工况一 ITAE 4.15 稍好但过冷 0.64 °C（v3 是 0.29 °C）；工况二/三的调节时间分别顶到 5.00 h / 6.00 h 的窗口边（时间到了还没稳住）、过冷破 1 °C。实话实说：</w:t>
       </w:r>
       <w:r>
         <w:rPr>
@@ -3148,7 +3234,7 @@
           <w:i w:val="0"/>
           <w:sz w:val="21"/>
         </w:rPr>
-        <w:t>部署门优化的是 commissioning 分布下的风险目标，不是这三类工况</w:t>
+        <w:t>留用的标准是在调试工况分布上算账划算，不是这三类工况考得好</w:t>
       </w:r>
       <w:r>
         <w:rPr>
@@ -3157,7 +3243,7 @@
           <w:i w:val="0"/>
           <w:sz w:val="21"/>
         </w:rPr>
-        <w:t>——同一条路线两次采样给出优劣不同的候选，这正是输出非确定性的直接证据，也是第 4 节强调"看分布不看单次"的原因。</w:t>
+        <w:t>——同一条路线两次抽中好坏不同的参数，这就是输出不稳定的直接证据，也是第 4 节强调"看分布不看单次"的原因。</w:t>
       </w:r>
     </w:p>
     <w:p>
@@ -3522,7 +3608,7 @@
           <w:i w:val="0"/>
           <w:sz w:val="21"/>
         </w:rPr>
-        <w:t>：复合工况下，v4 部署增益综合目标 71.61（劣于 v3 候选的 65.89，主要差在 ITAE 17.72 与过冷 0.92 °C），开门后 0.27 h 恢复，启停各 2 次。必须强调三点边界：① 这是</w:t>
+        <w:t>：复合工况下，v4 这组参数综合目标 71.61（不如 v3 那组的 65.89，主要差在 ITAE 17.72 和过冷 0.92 °C），开门后 0.27 h 恢复，启停各 2 次。三句话边界，一个不能少：① 这是</w:t>
       </w:r>
       <w:r>
         <w:rPr>
@@ -3531,7 +3617,7 @@
           <w:i w:val="0"/>
           <w:sz w:val="21"/>
         </w:rPr>
-        <w:t>单次</w:t>
+        <w:t>一次</w:t>
       </w:r>
       <w:r>
         <w:rPr>
@@ -3540,7 +3626,7 @@
           <w:i w:val="0"/>
           <w:sz w:val="21"/>
         </w:rPr>
-        <w:t>真实调用的结果——v4 矩阵 17/18 会话候选全被拒、回退 IMC，输出非确定性是 LLM 路线的固有特征，任何单候选排名都不作数；② 不得解读为"LLM 比 RL 更会控制"，应解读为"LLM 作为低频诊断工具，其建议经安全门过滤后是安全可用的"；③ v3 候选（65.89）与 v4 候选（71.61）的差距来自两次非确定性采样选中了不同增益，不是路线退化。</w:t>
+        <w:t>真实调用留下来的——v4 矩阵里 17/18 次提的都被退回了，模型输出本来就不稳定，拿任何单组参数去排名都是耍流氓；② 别解读成"LLM 比 RL 更会控制"，正确读法是"LLM 当个低频参谋，它提的建议被过滤后用起来是安全的"；③ v3（65.89）和 v4（71.61）的差距就是两次抽中了不同的参数，不是路线变差了。</w:t>
       </w:r>
     </w:p>
     <w:p>
@@ -3580,7 +3666,7 @@
           <w:i w:val="0"/>
           <w:sz w:val="21"/>
         </w:rPr>
-        <w:t>优点：零训练、零梯度，工程集成成本最低；推理过程（诊断→假设→验证）天然可读、可审计；安全门兜底保证零失控；</w:t>
+        <w:t>优点：零训练、零梯度，接进来最省事；它怎么想的全写下来了，能审计；最后有兜底，保证不出格；</w:t>
       </w:r>
     </w:p>
     <w:p>
@@ -3605,7 +3691,7 @@
           <w:i w:val="0"/>
           <w:sz w:val="21"/>
         </w:rPr>
-        <w:t>缺点：耗时与费用比经典方法高 1–2 个数量级；输出非确定，已有 v3（18 次，5/18 部署）与 v4（18 次，1/18 部署，另 3/18 fallback 自身不稳定）两次独立采样，但 36 次仍不足以做严格的模型间显著性比较；能力上限依赖模型本身；</w:t>
+        <w:t>缺点：耗时和花钱比经典方法高 1–2 个数量级；答案不稳定，好在现在有 v3（18 次，留下 5 个）和 v4（18 次，留下 1 个，另有 3 次是老参数自己跑不稳）两次实测，但 36 次还不够给模型之间判高下；天花板看模型本身；</w:t>
       </w:r>
     </w:p>
     <w:p>
@@ -3630,7 +3716,7 @@
           <w:i w:val="0"/>
           <w:sz w:val="21"/>
         </w:rPr>
-        <w:t>落地建议：定位为"远程 commissioning 助手"——低频、离线、建议制；启发式 dry-run 只能验证安全流水线，不能作为 LLM 效果证据；规模化前需多批次真实调用统计。</w:t>
+        <w:t>落地建议：就当"远程调试助手"用——低频、离线、只给建议；启发式 dry-run 只能证明管子通了，不能证明 LLM 好用；真要上量，先多跑几批真实调用看分布。</w:t>
       </w:r>
     </w:p>
     <w:p>
@@ -3798,7 +3884,7 @@
                 <w:i w:val="0"/>
                 <w:sz w:val="18"/>
               </w:rPr>
-              <w:t>真实调用会话轨迹（6 步 / 2 次候选试验 / 1 次接受）</w:t>
+              <w:t>v3 走读会话轨迹（6 步 / 2 次候选试验 / 1 次留下），现作对照</w:t>
             </w:r>
           </w:p>
         </w:tc>
@@ -4340,7 +4426,7 @@
                 <w:i w:val="0"/>
                 <w:sz w:val="18"/>
               </w:rPr>
-              <w:t>监督式 LLM 整定流程与安全门</w:t>
+              <w:t>监督式 LLM 整定流程与兜底检查</w:t>
             </w:r>
           </w:p>
         </w:tc>
@@ -4458,7 +4544,7 @@
           <w:i w:val="0"/>
           <w:sz w:val="21"/>
         </w:rPr>
-        <w:t>模型输出具有非确定性</w:t>
+        <w:t>模型每次给的答案可能不一样</w:t>
       </w:r>
       <w:r>
         <w:rPr>
@@ -4467,7 +4553,7 @@
           <w:i w:val="0"/>
           <w:sz w:val="21"/>
         </w:rPr>
-        <w:t>，重复运行不保证得到同一组增益；矩阵 18 次中 17 次候选全部被拒、系统回退 IMC。18 次会话均未越界、零失控。若未配置 API 密钥，脚本自动回退到启发式 provider，可用于验证流水线但</w:t>
+        <w:t>，重跑不保证拿到同一组参数；矩阵 18 次里 17 次提的都没留下、还原样用老参数。18 次都没越界、没失控。没配 API 密钥时，脚本会自动用启发式顶上——能证明管子是通的，但</w:t>
       </w:r>
       <w:r>
         <w:rPr>
@@ -4485,7 +4571,7 @@
           <w:i w:val="0"/>
           <w:sz w:val="21"/>
         </w:rPr>
-        <w:t>作为 LLM 效果证据。</w:t>
+        <w:t>拿它说 LLM 好用。</w:t>
       </w:r>
     </w:p>
     <w:sectPr>

</xml_diff>

<commit_message>
06 sample: normal blog tone, slang removed, structure frozen
</commit_message>
<xml_diff>
--- a/reports/分报告/06_算法报告_LLM-Agent工具调用整定.docx
+++ b/reports/分报告/06_算法报告_LLM-Agent工具调用整定.docx
@@ -41,27 +41,7 @@
           <w:color w:val="595959"/>
           <w:sz w:val="19"/>
         </w:rPr>
-        <w:t>：你有一个调好的 IMC 参数，大模型帮你试着微调——它只能"看历史、提候选"，</w:t>
-      </w:r>
-      <w:r>
-        <w:rPr>
-          <w:rFonts w:ascii="微软雅黑" w:hAnsi="微软雅黑" w:eastAsia="微软雅黑"/>
-          <w:b/>
-          <w:i w:val="0"/>
-          <w:color w:val="595959"/>
-          <w:sz w:val="19"/>
-        </w:rPr>
-        <w:t>换不换它说了不算</w:t>
-      </w:r>
-      <w:r>
-        <w:rPr>
-          <w:rFonts w:ascii="微软雅黑" w:hAnsi="微软雅黑" w:eastAsia="微软雅黑"/>
-          <w:b w:val="0"/>
-          <w:i w:val="0"/>
-          <w:color w:val="595959"/>
-          <w:sz w:val="19"/>
-        </w:rPr>
-        <w:t xml:space="preserve">，仿真器算一遍账，好才换、不好就留原样。想自己跑：一条命令 </w:t>
+        <w:t xml:space="preserve">：你有一个调好的 IMC 参数，大模型帮你试着微调——它只负责"看历史、提候选"，是否采用由仿真器验证后决定：验证更好就采用，否则保留原参数。想自己跑：一条命令 </w:t>
       </w:r>
       <w:r>
         <w:rPr>
@@ -81,7 +61,7 @@
           <w:color w:val="595959"/>
           <w:sz w:val="19"/>
         </w:rPr>
-        <w:t xml:space="preserve">，几十秒出结果（要花一点 API 钱，key 放 </w:t>
+        <w:t xml:space="preserve">，几十秒出结果（会产生少量 API 费用，key 放 </w:t>
       </w:r>
       <w:r>
         <w:rPr>
@@ -216,7 +196,7 @@
           <w:i w:val="0"/>
           <w:sz w:val="21"/>
         </w:rPr>
-        <w:t>最后拍板的是仿真器和一道死的检查规则，不是模型</w:t>
+        <w:t>最终是否采用由仿真器验证结果和固定检查规则决定，而不是由模型决定</w:t>
       </w:r>
       <w:r>
         <w:rPr>
@@ -392,7 +372,7 @@
                 <w:i w:val="0"/>
                 <w:sz w:val="18"/>
               </w:rPr>
-              <w:t xml:space="preserve">Kp/Ki 修改建议（模型原话 → 限幅 → 留下/扔掉）；v4 走读留下 </w:t>
+              <w:t xml:space="preserve">Kp/Ki 修改建议（模型建议值 → 限幅 → 采用/舍弃）；v4 走读采用 </w:t>
             </w:r>
             <w:r>
               <w:rPr>
@@ -410,7 +390,7 @@
                 <w:i w:val="0"/>
                 <w:sz w:val="18"/>
               </w:rPr>
-              <w:t>（老参数 0.5175/0.0040536 的九折；v3 走读留下的是 0.4057/0.002769，起点不一样，见第 4 节）</w:t>
+              <w:t>（基线参数 0.5175/0.0040536 的 90%；v3 走读采用的是 0.4057/0.002769，基线不同，见第 4 节）</w:t>
             </w:r>
           </w:p>
         </w:tc>
@@ -781,7 +761,7 @@
                 <w:i w:val="0"/>
                 <w:sz w:val="18"/>
               </w:rPr>
-              <w:t>Agent 自己决定看什么、试什么，不用人一步步点；但它只负责"诊断+给建议"，不保证找到全局最优</w:t>
+              <w:t>Agent 自己决定查看什么、尝试什么，不需要人工逐步操作；但它只负责"诊断+给建议"，不保证找到全局最优</w:t>
             </w:r>
           </w:p>
         </w:tc>
@@ -896,7 +876,7 @@
           <w:i w:val="0"/>
           <w:sz w:val="21"/>
         </w:rPr>
-        <w:t>没通过，弃了</w:t>
+        <w:t>未通过，被舍弃</w:t>
       </w:r>
       <w:r>
         <w:rPr>
@@ -905,7 +885,7 @@
           <w:i w:val="0"/>
           <w:sz w:val="21"/>
         </w:rPr>
-        <w:t xml:space="preserve"> → 候选②（小幅减小 Kp/Ki 至 0.4657/0.003648，风险 59.49→58.86，变好 1.05%）</w:t>
+        <w:t xml:space="preserve"> → 候选②（小幅减小 Kp/Ki 至 0.4657/0.003648，风险 59.49→58.86，改善 1.05%）</w:t>
       </w:r>
       <w:r>
         <w:rPr>
@@ -914,7 +894,7 @@
           <w:i w:val="0"/>
           <w:sz w:val="21"/>
         </w:rPr>
-        <w:t>留下并用上了</w:t>
+        <w:t>被采用</w:t>
       </w:r>
       <w:r>
         <w:rPr>
@@ -923,7 +903,7 @@
           <w:i w:val="0"/>
           <w:sz w:val="21"/>
         </w:rPr>
-        <w:t xml:space="preserve"> → Agent 主动收工（自述"预算仅剩 1 次、已有边际改善，不值得再冒险，部署当前已接受增益"）。v3 走读（基线 0.4508/0.003077，风险 32.01→30.68，好 4.15%，留下 0.4057/0.002769）保留在第 4 节作对照——</w:t>
+        <w:t xml:space="preserve"> → Agent 主动结束（自述"预算仅剩 1 次、已有边际改善，不值得再冒险，部署当前已接受增益"）。v3 走读（基线 0.4508/0.003077，风险 32.01→30.68，好 4.15%，留下 0.4057/0.002769）保留在第 4 节作对照——</w:t>
       </w:r>
       <w:r>
         <w:rPr>
@@ -932,7 +912,7 @@
           <w:i w:val="0"/>
           <w:sz w:val="21"/>
         </w:rPr>
-        <w:t>两次起点不同（0.5175 和 0.4508），总分不可跨批次直接比，只能各自看变好多少和留没留下</w:t>
+        <w:t>两次基线不同（0.5175 和 0.4508），总分不可跨批次直接比较，只能各自看相对改善与是否被采用</w:t>
       </w:r>
       <w:r>
         <w:rPr>
@@ -941,7 +921,7 @@
           <w:i w:val="0"/>
           <w:sz w:val="21"/>
         </w:rPr>
-        <w:t>。v4 矩阵剩下 17 次提的还原样用老参数；18 次都没越界、没失控，兜底正常干活。</w:t>
+        <w:t>。v4 矩阵其余 17 次保留原参数；18 次均未越界、零失控，保护机制正常生效。</w:t>
       </w:r>
     </w:p>
     <w:p>
@@ -1007,7 +987,7 @@
           <w:i w:val="0"/>
           <w:sz w:val="21"/>
         </w:rPr>
-        <w:t>（翻历史记录）、</w:t>
+        <w:t>（查看历史记录）、</w:t>
       </w:r>
       <w:r>
         <w:rPr>
@@ -1026,7 +1006,7 @@
           <w:i w:val="0"/>
           <w:sz w:val="21"/>
         </w:rPr>
-        <w:t>（报一组候选数、让宿主拿仿真器验货）、</w:t>
+        <w:t>（提交一组候选参数，请求宿主用仿真器评估）、</w:t>
       </w:r>
       <w:r>
         <w:rPr>
@@ -1045,7 +1025,7 @@
           <w:i w:val="0"/>
           <w:sz w:val="21"/>
         </w:rPr>
-        <w:t>（主动收工）。关键在于</w:t>
+        <w:t>（主动结束）。关键在于</w:t>
       </w:r>
       <w:r>
         <w:rPr>
@@ -1054,7 +1034,7 @@
           <w:i w:val="0"/>
           <w:sz w:val="21"/>
         </w:rPr>
-        <w:t>候选能不能用，由宿主按死规则说了算，不由模型说了算</w:t>
+        <w:t>候选能否使用由宿主按固定规则判定，而非由模型决定</w:t>
       </w:r>
       <w:r>
         <w:rPr>
@@ -1063,7 +1043,7 @@
           <w:i w:val="0"/>
           <w:sz w:val="21"/>
         </w:rPr>
-        <w:t>：只有"算完账确实比原来好"的候选才被留下，不好的直接扔掉、但试验次数照扣。图 6-2 把一次真实调用会话的每一步画了出来。</w:t>
+        <w:t>：只有经评估确认优于当前参数的候选才会被采用，未通过的候选不改变当前参数，但会消耗一次试验机会。图 6-2 把一次真实调用会话的每一步画了出来。</w:t>
       </w:r>
     </w:p>
     <w:p>
@@ -1858,7 +1838,7 @@
                 <w:i w:val="0"/>
                 <w:sz w:val="18"/>
               </w:rPr>
-              <w:t>宿主最后再验一次、确认能用</w:t>
+              <w:t>宿主执行最终复核，确认后采用</w:t>
             </w:r>
           </w:p>
         </w:tc>
@@ -1910,7 +1890,7 @@
           <w:i w:val="0"/>
           <w:sz w:val="21"/>
         </w:rPr>
-        <w:t>拍板的是宿主，不是模型</w:t>
+        <w:t>做决定的是宿主，不是模型</w:t>
       </w:r>
       <w:r>
         <w:rPr>
@@ -1919,7 +1899,7 @@
           <w:i w:val="0"/>
           <w:sz w:val="21"/>
         </w:rPr>
-        <w:t>。2 次候选试验里，模型"想改"的都拿去仿真器真算了一遍，但只留了 1 个。第 4 步模型想加增益，宿主算完账发现更差了（−2.30%）就挡了回去——</w:t>
+        <w:t>。2 次候选试验中，模型提出的修改都经过了仿真器实际评估，但只采用了 1 个。第 4 步模型想增大增益，宿主评估发现效果变差（−2.30%），因此未采用——</w:t>
       </w:r>
       <w:r>
         <w:rPr>
@@ -1937,7 +1917,7 @@
           <w:i w:val="0"/>
           <w:sz w:val="21"/>
         </w:rPr>
-        <w:t>，这就是"不行就不用"的样子。第 5 步模型换了个方向（从"加大"改成"减小"）才通过；注意它先连看了 3 次历史才动手，比 v3 走读更稳。</w:t>
+        <w:t>，这就是拒绝机制在图上的体现。第 5 步模型改换方向（从"增大"改为"减小"）后通过；注意它先连续查看了 3 次历史才行动，比 v3 走读更谨慎。</w:t>
       </w:r>
     </w:p>
     <w:p>
@@ -1962,7 +1942,7 @@
           <w:i w:val="0"/>
           <w:sz w:val="21"/>
         </w:rPr>
-        <w:t>模型的想法全程留痕，能审计</w:t>
+        <w:t>模型的推理过程全程有记录，可以审计</w:t>
       </w:r>
       <w:r>
         <w:rPr>
@@ -1990,7 +1970,7 @@
           <w:i w:val="0"/>
           <w:sz w:val="21"/>
         </w:rPr>
-        <w:t xml:space="preserve"> 字段都写了理由（"只在允许的 10% 幅度内动""还剩 2 次机会"），这是 BO / RL 这类纯数值搜索没有的——它为什么这么试，你看得见，这也是第 8 节说的"过程可读"的依据。</w:t>
+        <w:t xml:space="preserve"> 字段都写明了理由（"只在允许的 10% 幅度内调整""还剩 2 次机会"），这是 BO / RL 这类纯数值搜索所没有的——它为什么这样尝试，是可见的，这也是第 8 节"过程可读、可审计"结论的依据。</w:t>
       </w:r>
     </w:p>
     <w:p>
@@ -2015,7 +1995,7 @@
           <w:i w:val="0"/>
           <w:sz w:val="21"/>
         </w:rPr>
-        <w:t>改良幅度不大，它就是个微调工</w:t>
+        <w:t>改善幅度不大，它的定位是小幅微调</w:t>
       </w:r>
       <w:r>
         <w:rPr>
@@ -2024,7 +2004,7 @@
           <w:i w:val="0"/>
           <w:sz w:val="21"/>
         </w:rPr>
-        <w:t>。风险目标从 59.49 降到 58.86，只好了 1.05%；新参数 Kp=0.4657、Ki=0.003648 都是往</w:t>
+        <w:t>。风险目标从 59.49 降到 58.86，仅改善 1.05%；新参数 Kp=0.4657、Ki=0.003648 均为</w:t>
       </w:r>
       <w:r>
         <w:rPr>
@@ -2042,7 +2022,7 @@
           <w:i w:val="0"/>
           <w:sz w:val="21"/>
         </w:rPr>
-        <w:t>方向走，而且正好是老参数打九折（</w:t>
+        <w:t>方向，且恰好为基线参数的 90%（</w:t>
       </w:r>
       <w:r>
         <w:rPr>
@@ -2051,7 +2031,7 @@
           <w:i w:val="0"/>
           <w:sz w:val="21"/>
         </w:rPr>
-        <w:t>−10.0%，一步只允许走 10%，这次走满了</w:t>
+        <w:t>−10.0%，单步允许的最大调整幅度为 10%，本次用满</w:t>
       </w:r>
       <w:r>
         <w:rPr>
@@ -2060,7 +2040,7 @@
           <w:i w:val="0"/>
           <w:sz w:val="21"/>
         </w:rPr>
-        <w:t>）。别指望它给你变出一个全局最优——它的产出就是"一次安全的、有理由的小调整"。另注意 v4 起点（0.5175/0.0040536）和 v3 走读起点（0.4508/0.003077）不一样，好几个百分点都是相对各自起点算的，总分（59 和 32）不能跨批次直接比。</w:t>
+        <w:t>）。不应期待它给出全局最优解——它的产出是"一次安全的、有理由的小幅调整"。另注意 v4 基线（0.5175/0.0040536）与 v3 走读基线（0.4508/0.003077）不同，改善百分比均相对于各自基线计算，总分（59 和 32）不能跨批次直接比较。</w:t>
       </w:r>
     </w:p>
     <w:p>
@@ -2085,7 +2065,7 @@
           <w:i w:val="0"/>
           <w:sz w:val="21"/>
         </w:rPr>
-        <w:t>实话实说：模型每次给的答案可能不一样，v4 拿 18 次证明了这点</w:t>
+        <w:t>需要说明的是：模型每次输出可能不同，v4 用 18 次验证了这一点</w:t>
       </w:r>
       <w:r>
         <w:rPr>
@@ -2094,7 +2074,7 @@
           <w:i w:val="0"/>
           <w:sz w:val="21"/>
         </w:rPr>
-        <w:t>。v4 矩阵 18 次真实调用里只有 1 次留下了候选（</w:t>
+        <w:t>。v4 矩阵 18 次真实调用中仅 1 次的候选被采用（</w:t>
       </w:r>
       <w:r>
         <w:rPr>
@@ -2113,7 +2093,7 @@
           <w:i w:val="0"/>
           <w:sz w:val="21"/>
         </w:rPr>
-        <w:t xml:space="preserve">，就是本节走读这篇），剩下 17 次提的都被退回、用回老参数；其中 </w:t>
+        <w:t xml:space="preserve">，即本节走读），其余 17 次的候选均未通过，保留原参数；其中 </w:t>
       </w:r>
       <w:r>
         <w:rPr>
@@ -2132,7 +2112,7 @@
           <w:i w:val="0"/>
           <w:sz w:val="21"/>
         </w:rPr>
-        <w:t xml:space="preserve"> 三个会话（三个模型各一）退回去的老参数在演示场景里本身就跑不稳（</w:t>
+        <w:t xml:space="preserve"> 三个会话（三个模型各一）所保留的基线参数在演示场景下本身就不稳定（</w:t>
       </w:r>
       <w:r>
         <w:rPr>
@@ -2151,25 +2131,7 @@
           <w:i w:val="0"/>
           <w:sz w:val="21"/>
         </w:rPr>
-        <w:t>）——注意这是</w:t>
-      </w:r>
-      <w:r>
-        <w:rPr>
-          <w:rFonts w:ascii="微软雅黑" w:hAnsi="微软雅黑" w:eastAsia="微软雅黑"/>
-          <w:b/>
-          <w:i w:val="0"/>
-          <w:sz w:val="21"/>
-        </w:rPr>
-        <w:t>老参数在那个种子下就不行</w:t>
-      </w:r>
-      <w:r>
-        <w:rPr>
-          <w:rFonts w:ascii="微软雅黑" w:hAnsi="微软雅黑" w:eastAsia="微软雅黑"/>
-          <w:b w:val="0"/>
-          <w:i w:val="0"/>
-          <w:sz w:val="21"/>
-        </w:rPr>
-        <w:t xml:space="preserve">，不是模型搞坏了，兜底和上线检查都正常接住了（18 次零越界、零失控）。v3 那边对照：18 次里留了 5 个、18 次全稳，走读是 </w:t>
+        <w:t xml:space="preserve">）——这说明不稳定来自基线参数与该场景的组合，而非模型输出异常，保护机制与上线检查均正常生效（18 次均未越界、零失控）。v3 对照情况：18 次中采用 5 个、18 次全部稳定，走读为 </w:t>
       </w:r>
       <w:r>
         <w:rPr>
@@ -2188,7 +2150,7 @@
           <w:i w:val="0"/>
           <w:sz w:val="21"/>
         </w:rPr>
-        <w:t>（32.01→30.68，好 4.15%，留下 0.4057/0.002769）。两次留存率不同（5/18 和 1/18），正好说明</w:t>
+        <w:t>（32.01→30.68，改善 4.15%，采用 0.4057/0.002769）。两次采用率不同（5/18 和 1/18），正说明</w:t>
       </w:r>
       <w:r>
         <w:rPr>
@@ -2197,7 +2159,7 @@
           <w:i w:val="0"/>
           <w:sz w:val="21"/>
         </w:rPr>
-        <w:t>看一次走读等于只看了一次抽奖，必须看分布</w:t>
+        <w:t>单次走读不能代表整体表现，必须看分布</w:t>
       </w:r>
       <w:r>
         <w:rPr>
@@ -2453,7 +2415,7 @@
                 <w:i w:val="0"/>
                 <w:sz w:val="18"/>
               </w:rPr>
-              <w:t>，18 次合计约 4.3 min（qwen-turbo 最快约 6 s，qwen-max 约 13–21 s，qwen-plus 约 11–25 s；均为 replay 之外的真实调用，费用按百炼账单）</w:t>
+              <w:t>，18 次合计约 4.3 min（qwen-turbo 最快约 6 s，qwen-max 约 13–21 s，qwen-plus 约 11–25 s；均为真实调用（非回放），费用按百炼账单）</w:t>
             </w:r>
           </w:p>
         </w:tc>
@@ -2521,7 +2483,7 @@
           <w:i w:val="0"/>
           <w:sz w:val="21"/>
         </w:rPr>
-        <w:t>补跑说明：拿 v4 走读留下的参数（0.4657/0.003648）在 v3 同对象、同约束、同种子下重跑一遍，标题写"补跑"（v3 参数 0.4057/0.002769 的旧表已归档，见附录 A）。</w:t>
+        <w:t>补跑说明：使用 v4 走读采用的参数（0.4657/0.003648）在 v3 相同对象、相同约束、相同种子下重新仿真，标题标注"补跑"（v3 参数 0.4057/0.002769 的旧表已归档，见附录 A）。</w:t>
       </w:r>
     </w:p>
     <w:tbl>
@@ -3207,7 +3169,7 @@
           <w:i w:val="0"/>
           <w:sz w:val="21"/>
         </w:rPr>
-        <w:t>：v4 留下的这组参数（0.4657）比 v3 那组（0.4057）更接近老参数、下手更重，所以三工况成绩</w:t>
+        <w:t>：v4 采用的参数（0.4657）比 v3（0.4057）更接近基线、调整幅度更大，因此三工况成绩</w:t>
       </w:r>
       <w:r>
         <w:rPr>
@@ -3225,7 +3187,7 @@
           <w:i w:val="0"/>
           <w:sz w:val="21"/>
         </w:rPr>
-        <w:t xml:space="preserve"> v3 那组：工况一 ITAE 4.15 稍好但过冷 0.64 °C（v3 是 0.29 °C）；工况二/三的调节时间分别顶到 5.00 h / 6.00 h 的窗口边（时间到了还没稳住）、过冷破 1 °C。实话实说：</w:t>
+        <w:t xml:space="preserve"> v3 那组：工况一 ITAE 4.15 稍好但过冷 0.64 °C（v3 为 0.29 °C）；工况二/三的调节时间分别达到 5.00 h / 6.00 h 的窗口边界（窗口内尚未收敛）、过冷超过 1 °C。需要明确：</w:t>
       </w:r>
       <w:r>
         <w:rPr>
@@ -3234,7 +3196,7 @@
           <w:i w:val="0"/>
           <w:sz w:val="21"/>
         </w:rPr>
-        <w:t>留用的标准是在调试工况分布上算账划算，不是这三类工况考得好</w:t>
+        <w:t>采用的标准是在调试工况分布下综合更优，而不是这三类工况得分更高</w:t>
       </w:r>
       <w:r>
         <w:rPr>
@@ -3243,7 +3205,7 @@
           <w:i w:val="0"/>
           <w:sz w:val="21"/>
         </w:rPr>
-        <w:t>——同一条路线两次抽中好坏不同的参数，这就是输出不稳定的直接证据，也是第 4 节强调"看分布不看单次"的原因。</w:t>
+        <w:t>——同一条路线两次采样得到优劣不同的参数，这正是输出不稳定的直接证据，也是第 4 节强调"看分布不看单次"的原因。</w:t>
       </w:r>
     </w:p>
     <w:p>
@@ -3608,7 +3570,7 @@
           <w:i w:val="0"/>
           <w:sz w:val="21"/>
         </w:rPr>
-        <w:t>：复合工况下，v4 这组参数综合目标 71.61（不如 v3 那组的 65.89，主要差在 ITAE 17.72 和过冷 0.92 °C），开门后 0.27 h 恢复，启停各 2 次。三句话边界，一个不能少：① 这是</w:t>
+        <w:t>：复合工况下，v4 这组参数综合目标 71.61（不如 v3 那组的 65.89，主要差在 ITAE 17.72 和过冷 0.92 °C），开门后 0.27 h 恢复，启停各 2 次。以下三点缺一不可：① 这是</w:t>
       </w:r>
       <w:r>
         <w:rPr>
@@ -3626,7 +3588,7 @@
           <w:i w:val="0"/>
           <w:sz w:val="21"/>
         </w:rPr>
-        <w:t>真实调用留下来的——v4 矩阵里 17/18 次提的都被退回了，模型输出本来就不稳定，拿任何单组参数去排名都是耍流氓；② 别解读成"LLM 比 RL 更会控制"，正确读法是"LLM 当个低频参谋，它提的建议被过滤后用起来是安全的"；③ v3（65.89）和 v4（71.61）的差距就是两次抽中了不同的参数，不是路线变差了。</w:t>
+        <w:t>真实调用的结果——v4 矩阵中 17/18 次的提议均未通过，模型输出本身不稳定，用任何单组参数做排名都没有意义；② 不应解读为"LLM 比 RL 更会控制"，应理解为"LLM 适合承担低频顾问角色，其建议经过滤后使用是安全的"；③ v3（65.89）与 v4（71.61）的差距源于两次采样选中了不同参数，不是路线变差。</w:t>
       </w:r>
     </w:p>
     <w:p>
@@ -3666,7 +3628,7 @@
           <w:i w:val="0"/>
           <w:sz w:val="21"/>
         </w:rPr>
-        <w:t>优点：零训练、零梯度，接进来最省事；它怎么想的全写下来了，能审计；最后有兜底，保证不出格；</w:t>
+        <w:t>优点：零训练、零梯度，接入成本最低；推理过程完整记录，可审计；有保护机制，不会超出安全范围；</w:t>
       </w:r>
     </w:p>
     <w:p>
@@ -3691,7 +3653,7 @@
           <w:i w:val="0"/>
           <w:sz w:val="21"/>
         </w:rPr>
-        <w:t>缺点：耗时和花钱比经典方法高 1–2 个数量级；答案不稳定，好在现在有 v3（18 次，留下 5 个）和 v4（18 次，留下 1 个，另有 3 次是老参数自己跑不稳）两次实测，但 36 次还不够给模型之间判高下；天花板看模型本身；</w:t>
+        <w:t>缺点：耗时和费用比经典方法高 1–2 个数量级；输出不稳定，目前已有 v3（18 次，采用 5 个）与 v4（18 次，采用 1 个，另有 3 次系基线参数本身不稳定）两次实测，但 36 次尚不足以对模型间做显著性比较；效果上限取决于模型本身；</w:t>
       </w:r>
     </w:p>
     <w:p>
@@ -3716,7 +3678,7 @@
           <w:i w:val="0"/>
           <w:sz w:val="21"/>
         </w:rPr>
-        <w:t>落地建议：就当"远程调试助手"用——低频、离线、只给建议；启发式 dry-run 只能证明管子通了，不能证明 LLM 好用；真要上量，先多跑几批真实调用看分布。</w:t>
+        <w:t>落地建议：建议定位为"远程调试助手"——低频、离线、只给建议；启发式 dry-run 只能证明链路正常，不能证明 LLM 好用；规模化应用前，先多跑几批真实调用看分布。</w:t>
       </w:r>
     </w:p>
     <w:p>
@@ -4037,7 +3999,7 @@
                 <w:i w:val="0"/>
                 <w:sz w:val="18"/>
               </w:rPr>
-              <w:t>独立真实调用会话轨迹（候选被拒、回退 IMC）</w:t>
+              <w:t>独立真实调用会话轨迹（候选未通过，保留 IMC）</w:t>
             </w:r>
           </w:p>
         </w:tc>
@@ -4426,7 +4388,7 @@
                 <w:i w:val="0"/>
                 <w:sz w:val="18"/>
               </w:rPr>
-              <w:t>监督式 LLM 整定流程与兜底检查</w:t>
+              <w:t>监督式 LLM 整定流程与安全检查</w:t>
             </w:r>
           </w:p>
         </w:tc>
@@ -4544,7 +4506,7 @@
           <w:i w:val="0"/>
           <w:sz w:val="21"/>
         </w:rPr>
-        <w:t>模型每次给的答案可能不一样</w:t>
+        <w:t>模型每次输出可能不同</w:t>
       </w:r>
       <w:r>
         <w:rPr>
@@ -4553,7 +4515,7 @@
           <w:i w:val="0"/>
           <w:sz w:val="21"/>
         </w:rPr>
-        <w:t>，重跑不保证拿到同一组参数；矩阵 18 次里 17 次提的都没留下、还原样用老参数。18 次都没越界、没失控。没配 API 密钥时，脚本会自动用启发式顶上——能证明管子是通的，但</w:t>
+        <w:t>，重复运行不保证得到同一组参数；矩阵 18 次中 17 次的候选未通过，保留原参数。18 次均未越界、零失控。未配置 API 密钥时，脚本会自动切换为启发式模式——可用于验证链路，但</w:t>
       </w:r>
       <w:r>
         <w:rPr>
@@ -4571,7 +4533,7 @@
           <w:i w:val="0"/>
           <w:sz w:val="21"/>
         </w:rPr>
-        <w:t>拿它说 LLM 好用。</w:t>
+        <w:t>作为 LLM 效果证据。</w:t>
       </w:r>
     </w:p>
     <w:sectPr>

</xml_diff>